<commit_message>
DA21 GO SIYAHA: regenere les 3 Word (plan investissement, par rubrique/fournisseur, construction/amenagement) avec chiffres 15 velos - programme 983485 / prime 344220
</commit_message>
<xml_diff>
--- a/DA21_Construction_Amenagement_Infrastructure.docx
+++ b/DA21_Construction_Amenagement_Infrastructure.docx
@@ -4,6 +4,7 @@
   <w:body>
     <w:p>
       <w:pPr>
+        <w:spacing w:after="60"/>
         <w:jc w:val="center"/>
       </w:pPr>
       <w:r>
@@ -17,6 +18,7 @@
     </w:p>
     <w:p>
       <w:pPr>
+        <w:spacing w:after="60"/>
         <w:jc w:val="center"/>
       </w:pPr>
       <w:r>
@@ -37,11 +39,11 @@
         <w:tblLook w:firstColumn="1" w:firstRow="1" w:lastColumn="0" w:lastRow="0" w:noHBand="0" w:noVBand="1" w:val="04A0"/>
       </w:tblPr>
       <w:tblGrid>
-        <w:gridCol w:w="2085"/>
-        <w:gridCol w:w="2085"/>
-        <w:gridCol w:w="2085"/>
-        <w:gridCol w:w="2085"/>
-        <w:gridCol w:w="2085"/>
+        <w:gridCol w:w="2108"/>
+        <w:gridCol w:w="2108"/>
+        <w:gridCol w:w="2108"/>
+        <w:gridCol w:w="2108"/>
+        <w:gridCol w:w="2108"/>
       </w:tblGrid>
       <w:tr>
         <w:tc>
@@ -492,7 +494,7 @@
               <w:rPr>
                 <w:sz w:val="19"/>
               </w:rPr>
-              <w:t>Forage puits + infrastructure hydraulique (forage, réservoir, réseau de distribution)</w:t>
+              <w:t>Forage puits + infrastructure hydraulique (forage, réservoir, réseau)</w:t>
             </w:r>
           </w:p>
         </w:tc>
@@ -573,7 +575,7 @@
               <w:rPr>
                 <w:sz w:val="19"/>
               </w:rPr>
-              <w:t>Structure métallique éphémère – ateliers cuisine (ossature, couverture, dalle)</w:t>
+              <w:t>Structure éphémère ateliers cuisine (ossature, couverture, dalle)</w:t>
             </w:r>
           </w:p>
         </w:tc>
@@ -1060,19 +1062,20 @@
     </w:tbl>
     <w:p>
       <w:pPr>
-        <w:spacing w:before="200"/>
+        <w:spacing w:after="60"/>
       </w:pPr>
       <w:r>
         <w:rPr>
+          <w:b w:val="0"/>
           <w:color w:val="555555"/>
           <w:sz w:val="18"/>
         </w:rPr>
-        <w:t>Note : ce périmètre couvre uniquement les travaux de génie civil, d'aménagement et d'infrastructure. Les équipements (climatisation, mobilier, tapis, tables, sonorisation, ainsi que e-bikes, paintball, cuisine, solaire/pompe) relèvent de la rubrique « Matériel d'équipement » et de fournisseurs spécialisés. Construction = 110 000 DH TTC = 10,1 % du projet (plafond ≤ 20 %).</w:t>
+        <w:t>Note : périmètre travaux de génie civil, aménagement et infrastructure uniquement. Les équipements (climatisation, mobilier, sonorisation, e-bikes, paintball, cuisine, solaire/pompe) relèvent du « Matériel ». Construction = 110 000 DH TTC = 10,0 % du projet (plafond ≤ 20 %).</w:t>
       </w:r>
     </w:p>
     <w:sectPr>
       <w:pgSz w:w="12240" w:h="15840"/>
-      <w:pgMar w:top="794" w:right="907" w:bottom="794" w:left="907" w:header="720" w:footer="720" w:gutter="0"/>
+      <w:pgMar w:top="794" w:right="850" w:bottom="794" w:left="850" w:header="720" w:footer="720" w:gutter="0"/>
       <w:cols w:space="720"/>
       <w:docGrid w:linePitch="360"/>
     </w:sectPr>

</xml_diff>